<commit_message>
T2: #14 y #15 (borrador), Word y plantilla PPT más livianos para subir al Drive
Co-Authored-By: Claude Opus 5.5 <noreply@anthropic.com>
Claude-Session: https://claude.ai/code/session_01Kfbf7cfV7pXUcNjjyaPCzV
</commit_message>
<xml_diff>
--- a/04-reformulacion/T2/docx/T2_18_Gantt.docx
+++ b/04-reformulacion/T2/docx/T2_18_Gantt.docx
@@ -154,7 +154,7 @@
       <w:r>
         <w:drawing>
           <wp:inline distT="0" distB="0" distL="0" distR="0">
-            <wp:extent cx="5715000" cy="3209925"/>
+            <wp:extent cx="5715000" cy="3219450"/>
             <wp:effectExtent t="0" r="0" b="0" l="0"/>
             <wp:docPr id="1" name="" descr="" title=""/>
             <wp:cNvGraphicFramePr>
@@ -179,7 +179,7 @@
                   <pic:spPr bwMode="auto">
                     <a:xfrm>
                       <a:off x="0" y="0"/>
-                      <a:ext cx="5715000" cy="3209925"/>
+                      <a:ext cx="5715000" cy="3219450"/>
                     </a:xfrm>
                     <a:prstGeom prst="rect">
                       <a:avLst/>

</xml_diff>